<commit_message>
Proofread manuscript, add subgroup Wald tests, update literature review with 2025-2026 studies
- code/04_main_models.py: Wald tests of equality of coalition-subgroup effects (summary_main.json)
- code/08_build_paper.py: new numbers (ranges, subgroup tests, distance-gradient share, bootstrap SE inflation)
- paper: wording fixes after number-by-number check against results; new section 5.3
  (comparison with literature); literature review extended (Yalcin et al. 2025, Egorov et al. 2025,
  Chupilkin et al. 2025/2026, Sjoholm 2026, Izotov 2025, Nagengast-Yotov 2025); corrected bibliographic details

Co-Authored-By: Claude Sonnet 5.5 <noreply@anthropic.com>
Claude-Session: https://claude.ai/code/session_01B5zL2ZcS68bgGDdPufAh3S
</commit_message>
<xml_diff>
--- a/paper/article_ru.docx
+++ b/paper/article_ru.docx
@@ -1130,7 +1130,7 @@
         <w:pStyle w:val="FirstParagraph"/>
       </w:pPr>
       <w:r>
-        <w:t xml:space="preserve">Сантос Силва и Тенрейро [Santos Silva, Tenreyro, 2006] показали, что МНК по логарифмированной модели при гетероскедастичности даёт несостоятельные оценки (в силу неравенства Йенсена) и не допускает нулевых потоков; они предложили оценивать модель в уровнях методом квазимаксимального правдоподобия Пуассона (PPML). Этот результат подтверждён дальнейшими исследованиями [Santos Silva, Tenreyro, 2011, 2022]. Фалли [Fally, 2015] доказал, что PPML с фиксированными эффектами экспортёра и импортёра согласуется со структурными ограничениями на многосторонние сопротивления. При оценке эффектов торговой политики на панельных данных рекомендуется включать парные фиксированные эффекты: политика (соглашения, ограничения) эндогенна по отношению к неизменным во времени характеристикам пар [Baier, Bergstrand, 2007; Egger, Larch, 2008; Baier et al., 2019].</w:t>
+        <w:t xml:space="preserve">Сантос Силва и Тенрейро [Santos Silva, Tenreyro, 2006] показали, что МНК по логарифмированной модели при гетероскедастичности даёт несостоятельные оценки (в силу неравенства Йенсена) и не допускает нулевых потоков; они предложили оценивать модель в уровнях методом квазимаксимального правдоподобия Пуассона (PPML). Этот результат подтверждён дальнейшими исследованиями [Santos Silva, Tenreyro, 2011, 2022]. Фалли [Fally, 2015] доказал, что PPML с фиксированными эффектами экспортёра и импортёра согласуется со структурными ограничениями на многосторонние сопротивления. При оценке эффектов торговой политики на панельных данных рекомендуется включать парные фиксированные эффекты: политика (соглашения, ограничения) эндогенна по отношению к неизменным во времени характеристикам пар [Baier, Bergstrand, 2007; Egger, Larch, 2008; Baier et al., 2019]. Недавние работы переносят в гравитационные модели методы оценки «разности разностей» при ступенчатом введении политики: Нагенгаст и Йотов [Nagengast, Yotov, 2025] встраивают расширенную оценку с двусторонними фиксированными эффектами в структурную гравитацию и показывают, что традиционные оценки эффектов торговых соглашений могут быть занижены более чем наполовину. В нашей постановке моменты воздействия общие для всех обработанных пар (2014 и 2022 гг.), поэтому проблема «запрещённых сравнений» между пространственными единицами с разным временем воздействия не возникает, но анализ динамики эффектов остаётся необходимым.</w:t>
       </w:r>
     </w:p>
     <w:p>
@@ -1156,7 +1156,7 @@
         <w:pStyle w:val="FirstParagraph"/>
       </w:pPr>
       <w:r>
-        <w:t xml:space="preserve">Классический обзор эффективности санкций [Hufbauer et al., 2007] фиксирует широкий разброс исходов; исторический контекст дан в [Mulder, 2022]. Для количественного анализа санкций создана Global Sanctions Data Base [Felbermayr et al., 2020a; Syropoulos et al., 2024]. На её основе показано, что санкции в рамках структурной гравитационной модели значимо сокращают двустороннюю торговлю, причём эффект существенно зависит от типа и полноты ограничений [Felbermayr et al., 2020b]; междисциплинарный обзор подходов приведён в [Felbermayr et al., 2021]. Теоретический анализ адресных санкций дан в [Ahn, Ludema, 2020]; влияние санкций на экономический рост — в [Neuenkirch, Neumeier, 2015].</w:t>
+        <w:t xml:space="preserve">Классический обзор эффективности санкций [Hufbauer et al., 2007] фиксирует широкий разброс исходов; исторический контекст дан в [Mulder, 2022]. Для количественного анализа санкций создана Global Sanctions Data Base [Felbermayr et al., 2020; Syropoulos et al., 2024]. На её основе показано, что санкции в рамках структурной гравитационной модели значимо сокращают двустороннюю торговлю, причём эффект существенно зависит от типа и полноты ограничений и от направления потока [Felbermayr et al., 2019]; междисциплинарный обзор подходов приведён в [Felbermayr et al., 2021]. Четвёртый выпуск базы, посвящённый режиму санкций против России, использован в [Yalcin et al., 2025]: средние эффекты ограничений на торговлю России со странами-инициаторами отрицательны и статистически значимы, но сравнительно невелики и сильно различаются между странами-инициаторами (в том числе внутри ЕС); оценки указывают также на снижение прямых торговых издержек России в торговле с Индией, Китаем и Турцией, которое может компенсировать эффект западных санкций. Теоретический анализ адресных санкций дан в [Ahn, Ludema, 2020]; влияние санкций на экономический рост — в [Neuenkirch, Neumeier, 2015].</w:t>
       </w:r>
     </w:p>
     <w:bookmarkEnd w:id="23"/>
@@ -1174,7 +1174,7 @@
         <w:pStyle w:val="FirstParagraph"/>
       </w:pPr>
       <w:r>
-        <w:t xml:space="preserve">Для эпизода 2014 г. наиболее близка к нашей работа [Crozet, Hinz, 2020], в которой на данных по товарным позициям оцениваются торговые последствия санкций и ответных мер: потери затронули как Россию, так и страны-инициаторы, при этом существенную роль сыграли ответные российские ограничения. Фирменные данные использованы в [Crozet et al., 2021]; потери российских потребителей от продовольственного эмбарго оценены в [Hinz, Monastyrenko, 2022]. Макроэкономические эффекты 2014 г. — финансовые ограничения, курс рубля, рост — рассматривались в [Gurvich, Prilepskiy, 2015; Dreger et al., 2016; Kholodilin, Netšunajev, 2019; Korhonen et al., 2018]; российская гравитационная литература включает обзор подходов к оцениванию [Шумилов, 2017], проверку гипотезы Линдера [Смирнов, 2020] и оценку влияния индекса свободы торговли [Упатина, 2021].</w:t>
+        <w:t xml:space="preserve">Для эпизода 2014 г. наиболее близка к нашей работа [Crozet, Hinz, 2020], в которой на данных по товарным позициям оцениваются торговые последствия санкций и ответных мер: потери России за 2014–2015 гг. оценены в 7,4 % прогнозного экспорта, потери стран-инициаторов — в 0,3 % их экспорта, причём основная часть последних пришлась на товары, не затронутые российским ответным эмбарго («дружественный огонь»), что авторы связывают прежде всего с ростом странового риска в операциях с Россией, а не с изменением предпочтений российских потребителей. Фирменные данные использованы в [Crozet et al., 2021]; потери российских потребителей от продовольственного эмбарго оценены в [Hinz, Monastyrenko, 2022]. Макроэкономические эффекты 2014 г. — финансовые ограничения, курс рубля, рост — рассматривались в [Gurvich, Prilepskiy, 2015; Dreger et al., 2016; Kholodilin, Netšunajev, 2019; Korhonen et al., 2018]; российская гравитационная литература включает обзор подходов к оцениванию [Шумилов, 2017], проверку гипотезы Линдера [Смирнов, 2020] и оценку влияния индекса свободы торговли [Упатина, 2021].</w:t>
       </w:r>
     </w:p>
     <w:p>
@@ -1182,7 +1182,7 @@
         <w:pStyle w:val="BodyText"/>
       </w:pPr>
       <w:r>
-        <w:t xml:space="preserve">Для эпизода 2022 г. накоплена быстро растущая литература: влияние санкций на валютный курс [Itskhoki, Mukhin, 2022], на экспорт нефти и его перенаправление в Азию [Babina et al., 2023], на экономику стран-инициаторов [Bachmann et al., 2022]. Отдельная линия исследований посвящена транзитной и реэкспортной торговле: в [Chupilkin et al., 2023] показано, что поставки в Россию из стран, введших ограничения, частично перенаправлялись через страны Кавказа и Центральной Азии. Более широкий контекст — геоэкономическая фрагментация: согласно [Aiyar et al., 2023; Gopinath et al., 2024; Campos et al., 2023], торговые и инвестиционные потоки всё сильнее зависят от геополитической близости; сопоставимые процессы — «перераспределение» цепочек поставок [Alfaro, Chor, 2023], торговая война США и Китая [Fajgelbaum, Khandelwal, 2022] и «френд-шоринг» [Javorcik et al., 2022]. Для российской торговли значимы также участие в ВТО и интеграция в рамках ЕАЭС [Lissovolik, Lissovolik, 2006; Tarr, 2016].</w:t>
+        <w:t xml:space="preserve">Для эпизода 2022 г. накоплена быстро растущая литература: влияние санкций на валютный курс [Itskhoki, Mukhin, 2022], на экспорт нефти и его перенаправление в Азию [Babina et al., 2023], на экономику стран-инициаторов [Bachmann et al., 2022]. Отдельная линия исследований, использующая товарные и транзакционные данные, посвящена замещению и перенаправлению торговли. В [Chupilkin et al., 2026] показано, что поставки в Россию из стран, введших ограничения, частично перенаправлялись через страны Кавказа и Центральной Азии; в [Chupilkin et al., 2025] на данных о транзакциях и торговых марках установлено, что значительная часть импорта товаров «западных» марок перенаправлялась через посредников в нейтральных странах, однако компенсировала лишь часть падения прямых поставок. По данным [Egorov et al., 2025], импорт санкционных товарных позиций в Россию после начала войны сократился более чем наполовину, а с учётом перенаправления через третьи страны суммарный импорт этих товаров снизился примерно на 30 %; в [Sjöholm, 2026] показано, что прирост прямого китайского экспорта в Россию был наибольшим в товарных линиях, где она сильнее зависела от поставок из ЕС, при этом значимая часть замещения шла через Гонконг, Армению, Казахстан, Киргизию и Турцию. Гравитационные оценки для России на агрегированных данных по-прежнему редки: в [Izotov, 2025] на данных за 1995–2024 гг. показано, что переориентация торговли на страны — члены ВТО и восстановление мировой торговли компенсировали значительную часть ущерба от западных санкций, тогда как вклад интеграционных соглашений был меньше. Более широкий контекст — геоэкономическая фрагментация: согласно [Aiyar et al., 2023; Gopinath et al., 2025; Campos et al., 2023], торговые и инвестиционные потоки всё сильнее зависят от геополитической близости; сопоставимые процессы — «перераспределение» цепочек поставок [Alfaro, Chor, 2023], торговая война США и Китая [Fajgelbaum, Khandelwal, 2022] и «френд-шоринг» [Javorcik et al., 2022]. Для российской торговли значимы также участие в ВТО и интеграция в рамках ЕАЭС [Lissovolik, Lissovolik, 2006; Tarr, 2016].</w:t>
       </w:r>
     </w:p>
     <w:bookmarkEnd w:id="24"/>
@@ -1200,7 +1200,7 @@
         <w:pStyle w:val="FirstParagraph"/>
       </w:pPr>
       <w:r>
-        <w:t xml:space="preserve">Из обзора следует, что (i) структурная гравитационная методология хорошо разработана, но (ii) в прикладных работах по России её требования нередко не соблюдаются, а (iii) для обоих санкционных эпизодов не хватает сопоставимых структурных оценок на едином панельном наборе данных, доведённом до 2024 г., с явной группой сравнения и анализом динамики. Кроме того, (iv) географический аспект переориентации — изменение чувствительности российской торговли к расстоянию — до сих пор оценивался преимущественно описательно, а (v) качество статистики о российской торговле после 2021 г. редко становится предметом самостоятельного аудита. Настоящая работа восполняет эти пробелы.</w:t>
+        <w:t xml:space="preserve">Из обзора следует, что (i) структурная гравитационная методология хорошо разработана, но (ii) в прикладных работах по России её требования нередко не соблюдаются, а (iii) для обоих санкционных эпизодов не хватает сопоставимых структурных оценок на едином панельном наборе данных, доведённом до 2024 г., с явной группой сравнения и анализом динамики (наиболее близкая по духу работа [Yalcin et al., 2025] опирается на базу санкций и оценивает гетерогенные эффекты по странам-инициаторам; наш акцент — на сопоставлении спецификаций, динамике эффектов по годам и географии переориентации торговли). Кроме того, (iv) географический аспект переориентации — изменение чувствительности российской торговли к расстоянию — до сих пор оценивался преимущественно описательно, а (v) качество статистики о российской торговле после 2021 г. редко становится предметом самостоятельного аудита. Настоящая работа восполняет эти пробелы.</w:t>
       </w:r>
     </w:p>
     <w:bookmarkEnd w:id="25"/>
@@ -5025,7 +5025,7 @@
         <w:t xml:space="preserve"> </w:t>
       </w:r>
       <w:r>
-        <w:t xml:space="preserve">Стандартные ошибки кластеризуются по парам стран. Поскольку «обработанных» российских пар лишь 14, дополнительно применяются: (а) диадно-робастные ошибки [Aronow et al., 2015]; (б) перестановочный тест — метка «коалиция» случайно присваивается 14 из 29 российских партнёров (кроме Украины и Республики Кореи) (500 назначений); (в) параметрический бутстрэп для оценки смещения от «несущественных параметров» [Weidner, Zylkin, 2021] и фактического покрытия доверительных интервалов (200 повторений); (г) исключение каждого российского партнёра поочерёдно. Оценки получены собственной реализацией PPML с разреженными эффектами «страна — год» и «пара» (код в репозитории); реализация проверена на</w:t>
+        <w:t xml:space="preserve">Стандартные ошибки кластеризуются по парам стран. Поскольку «обработанных» российских пар лишь 14, дополнительно применяются: (а) диадно-робастные ошибки [Aronow et al., 2015], допускающие произвольную зависимость между всеми парами с общей страной (отрицательные собственные значения оценки ковариационной матрицы заменяются нулями); (б) перестановочный тест — метка «коалиция» случайно присваивается 14 из 29 российских партнёров (кроме Украины и Республики Кореи) (500 назначений); (в) параметрический бутстрэп для оценки смещения от «несущественных параметров» [Weidner, Zylkin, 2021] и фактического покрытия доверительных интервалов (200 повторений); (г) исключение каждого российского партнёра поочерёдно. Оценки получены собственной реализацией PPML с разреженными эффектами «страна — год» и «пара» (код в репозитории); реализация проверена на</w:t>
       </w:r>
       <w:r>
         <w:t xml:space="preserve"> </w:t>
@@ -10324,7 +10324,7 @@
         <w:pStyle w:val="BodyText"/>
       </w:pPr>
       <w:r>
-        <w:t xml:space="preserve">Замена показателей размера, расстояния и политических индикаторов (столбец 2) возвращает коэффициенты в диапазон, типичный для гравитационной литературы: эластичность по совокупному размеру экономик равна 0,94 в МНК и 0,86 в PPML (теория предсказывает значение, близкое к единице), а эластичность по расстоянию — −1,24 и −0,75 соответственно, что соответствует мета-анализу [Disdier, Head, 2008] для PPML и традиционно более высокому по модулю значению для МНК. Гипотеза Линдера не подтверждается в PPML (−0,01; в МНК оценка значима, но её значимость исчезает при корректной оценке). Эффекты БРИКС и НАТО в столбцах (3)–(5) незначимы или отрицательны (БРИКС — −0,42 в столбце 3 и −0,27 в столбце 5; НАТО — −0,30 и −0,01): «преимущество» БРИКС в исходной модели — результат опущенного размера экономик. Переход от МНК к PPML резко меняет и оценки санкционных индикаторов (−0,79 против −0,30), что согласуется с выводом о смещении МНК при гетероскедастичности [Santos Silva, Tenreyro, 2006].</w:t>
+        <w:t xml:space="preserve">Замена показателей размера, расстояния и политических индикаторов (столбец 2) возвращает коэффициенты в диапазон, типичный для гравитационной литературы: эластичность по совокупному размеру экономик равна 0,94 в МНК и 0,86 в PPML (теория предсказывает значение, близкое к единице), а эластичность по расстоянию — −1,24 и −0,75 соответственно, что соответствует мета-анализу [Disdier, Head, 2008] для PPML и традиционно более высокому по модулю значению для МНК. Гипотеза Линдера [Linder, 1961] не подтверждается в PPML: оценка при модуле разности подушевых ВВП равна −0,01 и статистически незначима, тогда как в МНК она отрицательна и значима (−0,17). Эффекты БРИКС и НАТО в столбцах (3)–(5) незначимы или отрицательны (БРИКС — −0,42 в столбце 3 и −0,27 в столбце 5; НАТО — −0,30 и −0,01): «преимущество» БРИКС в исходной модели — результат опущенного размера экономик. Переход от МНК к PPML резко меняет и оценки санкционных индикаторов (−0,79 против −0,30), что согласуется с выводом о смещении МНК при гетероскедастичности [Santos Silva, Tenreyro, 2006].</w:t>
       </w:r>
     </w:p>
     <w:p>
@@ -10332,7 +10332,7 @@
         <w:pStyle w:val="BodyText"/>
       </w:pPr>
       <w:r>
-        <w:t xml:space="preserve">Введение эффектов «страна — год» (столбец 5) переводит анализ в рамки структурной гравитации: эластичность по расстоянию −0,79, общая граница увеличивает торговлю на 91 % (0,64), общий официальный язык значимого эффекта не даёт, а присоединение к ВТО (1,05) и участие в ЕАЭС (1,68) оказываются значимыми в сечении. Парные санкционные индикаторы устойчиво отрицательны во всех столбцах (2)–(6); оценки для режима 2014 г. находятся в диапазоне от −0,30 до −0,79, для режима 2022 г. — от −1,07 до −1,53 (рис. 2). Добавление парных эффектов (столбец 6) устраняет влияние неизменных характеристик пар и даёт −0,32 и −1,53.</w:t>
+        <w:t xml:space="preserve">Введение эффектов «страна — год» (столбец 5) переводит анализ в рамки структурной гравитации: эластичность по расстоянию −0,79, общая граница увеличивает торговлю на 91 % (0,64), общий официальный язык значимого эффекта не даёт, а совместное членство в ВТО (1,05) и в ЕАЭС/Таможенном союзе (1,68) оказывается значимым, но лишь за счёт межпарной вариации: после добавления парных эффектов (столбец 6) первый коэффициент теряет значимость (0,14), а второй меняет знак (−0,28). Парные санкционные индикаторы устойчиво отрицательны во всех столбцах (2)–(6); оценки для режима 2014 г. находятся в диапазоне от −0,30 до −0,79, для режима 2022 г. — от −1,07 до −1,53 (рис. 2). Добавление парных эффектов (столбец 6) устраняет влияние неизменных характеристик пар и даёт −0,32 и −1,53.</w:t>
       </w:r>
     </w:p>
     <w:p>
@@ -14454,7 +14454,7 @@
         <w:pStyle w:val="BodyText"/>
       </w:pPr>
       <w:r>
-        <w:t xml:space="preserve">Оценки устойчивы к спецификации. В расширенном окне 2000–2024 гг. (столбец 1) они равны −0,32 и −1,53; для эпизода 2014 г. в окне 2009–2021 гг. (столбец 3) — −0,40. Если выделить 2014 г. в отдельный «переходный» год (столбец 4), эффект в 2014 г. составляет −0,18, а в 2015 г. и позже — −0,46: основная часть изменений приходится на 2015 г. и позднее. При исключении помеченных наблюдений и «проблемных» партнёров (Беларусь, ОАЭ; столбец 5) оценки практически не меняются (−0,41 и −1,49). Поправка на линейный пре-тренд в длинной выборке (столбец 6) увеличивает оценку для 2014 г. до −0,51 при положительном пре-тренде 0,051 в год. Оценка МНК в логарифмах (столбец 7) заметно больше по модулю (−0,54 и −1,86) и, как показано выше, смещена. При поочерёдном исключении каждого из российских партнёров оценка</w:t>
+        <w:t xml:space="preserve">Оценки устойчивы к спецификации. В расширенном окне 2000–2024 гг. (столбец 1) они равны −0,32 и −1,53; для эпизода 2014 г. в окне 2009–2021 гг. (столбец 3) — −0,40. Если выделить 2014 г. в отдельный «переходный» год (столбец 4), эффект в 2014 г. составляет −0,18, а в 2015 г. и позже — −0,46: основная часть изменений приходится на 2015 г. и позднее. При исключении помеченных наблюдений и «проблемных» партнёров (Беларусь, ОАЭ; столбец 5) оценки практически не меняются (−0,41 и −1,49). Поправка на линейный пре-тренд в длинной выборке (столбец 6) увеличивает оценку для 2014 г. до −0,51 при положительном пре-тренде 0,051 в год. Оценки МНК в логарифмах (столбец 7) заметно больше по модулю (−0,54 и −1,86); различие того же типа, что и в табл. 1, и, по аргументу [Santos Silva, Tenreyro, 2006], указывает на смещение МНК при гетероскедастичности. При поочерёдном исключении каждого из российских партнёров оценка</w:t>
       </w:r>
       <w:r>
         <w:t xml:space="preserve"> </w:t>
@@ -14508,7 +14508,7 @@
         <w:t xml:space="preserve"> </w:t>
       </w:r>
       <w:r>
-        <w:t xml:space="preserve">— от −1,64 до −1,45. Среди контрольных переменных слабо значимо положительно членство в ЕС (0,15; в окне 2009–2024 гг. эта оценка идентифицируется исключительно выходом Великобритании из ЕС), а участие в ЕАЭС имеет отрицательный знак (−0,16); эффекты НАТО и БРИКС при парных эффектах идентифицируются лишь несколькими изменениями состава (вступление Финляндии в 2023 г., Египта и ОАЭ в 2024 г.) и статистически не отличимы от нуля.</w:t>
+        <w:t xml:space="preserve">— от −1,64 до −1,45. Среди контрольных переменных слабо значимо положительно членство в ЕС (0,15; в окне 2009–2024 гг. эта оценка идентифицируется исключительно выходом Великобритании из ЕС), а участие в ЕАЭС имеет отрицательный знак (−0,16); эффекты НАТО и БРИКС при парных эффектах идентифицируются лишь несколькими изменениями состава (вступление ЮАР в БРИКС в 2011 г., Финляндии в НАТО в 2023 г., Египта и ОАЭ в БРИКС в 2024 г.) и в основной спецификации статистически не отличимы от нуля.</w:t>
       </w:r>
     </w:p>
     <w:bookmarkEnd w:id="38"/>
@@ -14549,7 +14549,7 @@
         <w:t xml:space="preserve"> </w:t>
       </w:r>
       <w:r>
-        <w:t xml:space="preserve">из формулы (5) для 2000–2024 гг. (база — 2013 г.). До 2008 г. они отрицательны и значимы (в среднем −0,54 в 2000–2003 гг.): торговля России с будущими странами коалиции росла быстрее, чем с остальными партнёрами, — «догоняющий» рост на фоне вступления Прибалтики и Польши в ЕС, роста энергетического экспорта и подготовки к вступлению в ВТО. Совместный тест на равенство нулю опережающих коэффициентов 2000–2012 гг. отвергается (χ²(13) = 45,1, p &lt; 0,001), поэтому длинное «дособытийное» окно не удовлетворяет условию параллельных трендов. В окне 2009–2013 гг. дифференциального тренда нет: совместный тест для четырёх опережающих коэффициентов даёт χ²(4) = 2,54, p = 0,64. Это и обосновывает выбор окна 2009–2024 гг. как основного.</w:t>
+        <w:t xml:space="preserve">из формулы (5) для 2000–2024 гг. (база — 2013 г.). В 2000–2004 гг. они отрицательны и значимы (в среднем −0,54 в 2000–2003 гг.) и затем постепенно приближаются к нулю к 2009 г.: торговля России с будущими странами коалиции росла быстрее, чем с остальными партнёрами, — «догоняющий» рост, который можно связать со вступлением Прибалтики и Польши в ЕС, ростом энергетического экспорта и подготовкой к вступлению в ВТО (причинная интерпретация этих факторов в работе не проверялась). Совместный тест на равенство нулю опережающих коэффициентов 2000–2012 гг. отвергается (χ²(13) = 45,1, p &lt; 0,001), поэтому длинное «дособытийное» окно не удовлетворяет условию параллельных трендов. В окне 2009–2013 гг. дифференциального тренда нет: совместный тест для четырёх опережающих коэффициентов даёт χ²(4) = 2,54, p = 0,64. Это и обосновывает выбор окна 2009–2024 гг. как основного.</w:t>
       </w:r>
     </w:p>
     <w:p>
@@ -14620,7 +14620,7 @@
         <w:pStyle w:val="BodyText"/>
       </w:pPr>
       <w:r>
-        <w:t xml:space="preserve">Табл. 3 (А) и рис. 4 раскрывают состав эффекта. В первом эпизоде снижение наиболее сильно в ЕС-8 (−0,51, или −40 %), существенно слабее для группы «США, Канада, Австралия, Великобритания» (−0,23) и для Японии и Норвегии (−0,18). После 2022 г. дополнительные эффекты сопоставимы (−1,53, −1,81 и −1,23), различия между подгруппами лежат в пределах статистической погрешности.</w:t>
+        <w:t xml:space="preserve">Табл. 3 (А) и рис. 4 раскрывают состав эффекта. В первом эпизоде снижение наиболее сильно в ЕС-8 (−0,51, или −40 %), существенно слабее для группы «США, Канада, Австралия, Великобритания» (−0,23) и для Японии и Норвегии (−0,18). Гипотеза о равенстве эффектов трёх подгрупп уверенно отвергается для режима 2014 г. (χ²(2) = 75,5, p &lt; 0,001). После 2022 г. дополнительные эффекты (−1,53, −1,81 и −1,23) различаются гораздо слабее: равенство отвергается лишь на границе обычных уровней значимости (χ²(2) = 6,14, p = 0,046), и различие определяется более глубоким падением торговли с группой «США, Канада, Австралия, Великобритания» по сравнению с Японией и Норвегией.</w:t>
       </w:r>
     </w:p>
     <w:p>
@@ -17992,7 +17992,7 @@
         <w:pStyle w:val="FirstParagraph"/>
       </w:pPr>
       <w:r>
-        <w:t xml:space="preserve">Рис. 5 показывает отклонения торговли каждого российского партнёра от торговли «среднего» партнёра (в лог. пунктах) отдельно для 2014–2021 и 2022–2024 гг. при контроле эффектов «страна — год» и «пара». В 2014–2021 гг. наибольший относительный рост показывают Саудовская Аравия (0,66), ОАЭ (0,62), Грузия (0,60), ЮАР (0,45) и Индия (0,38), наибольшее снижение — Австралия (−0,70), Украина (−0,61), Литва (−0,53) и Польша (−0,47). В 2022–2024 гг. в лидерах по относительному росту — ОАЭ (3,00), Индия (2,55), Саудовская Аравия (1,79) и Китай (1,33), а затем Грузия, Бразилия, Азербайджан и Турция; наибольшее относительное снижение — у Финляндии (−3,52), Украины (−3,68), Литвы (−1,44), Австралии (−1,38) и Латвии (−1,29). Положительные отклонения Канады (0,73) и Республики Кореи (0,28) в 2022–2024 гг. противоречат ожидаемому знаку; вероятная причина — измерение (учёт товаров по стране происхождения, реэкспорт, неполнота зеркальной статистики), что подчёркивает необходимость верификации этих рядов по первичным источникам.</w:t>
+        <w:t xml:space="preserve">Рис. 5 показывает отклонения торговли каждого российского партнёра от торговли «среднего» партнёра (в лог. пунктах) отдельно для 2014–2021 и 2022–2024 гг. при контроле эффектов «страна — год» и «пара». В 2014–2021 гг. наибольший относительный рост показывают Саудовская Аравия (0,66), ОАЭ (0,62), Грузия (0,60), ЮАР (0,45) и Индия (0,38), наибольшее снижение — Австралия (−0,70), Украина (−0,61), Литва (−0,53) и Польша (−0,47). В 2022–2024 гг. в лидерах по относительному росту — ОАЭ (3,00), Индия (2,55), Саудовская Аравия (1,79) и Китай (1,33), а затем Грузия, Бразилия, Азербайджан и Турция; наибольшее относительное снижение — у Украины (−3,68), Финляндии (−3,52), Литвы (−1,44), Австралии (−1,38) и Латвии (−1,29). Положительные отклонения Канады (0,73) и Республики Кореи (0,28) в 2022–2024 гг. противоречат ожиданию: члены коалиции должны оказаться ниже «среднего» партнёра, в число которых входят и страны, нарастившие торговлю с Россией. Одно из возможных объяснений — ошибки измерения (учёт товаров по стране происхождения, реэкспорт, неполнота зеркальной статистики); аномалия подчёркивает необходимость верификации этих рядов по первичным источникам.</w:t>
       </w:r>
     </w:p>
     <w:p>
@@ -18055,7 +18055,7 @@
         <w:pStyle w:val="BodyText"/>
       </w:pPr>
       <w:r>
-        <w:t xml:space="preserve">Табл. 3 (Б) агрегирует результаты по подгруппам, принимая за базу пять оставшихся партнёров вне коалиции (Аргентина, Бразилия, Индонезия, Мексика, ЮАР). В 2014–2021 гг. значимо выросла торговля с Индией (0,26) и странами Залива и Египтом (0,34), тогда как для Китая (0,04) и «ЕАЭС и Кавказа» (0,10) сдвиг незначим, а для Турции он слабо отрицателен (−0,13; возможно, это отражает российско-турецкий торговый конфликт 2015–2016 гг.). После 2022 г. сдвиг велик для Индии (1,49, ст. ошибка 0,21) и значим для Китая (0,48, ст. ошибка 0,18); для стран Залива и Египта (0,58), Турции (0,22) и «ЕАЭС и Кавказа» (−0,23) он не отличим от нуля при больших стандартных ошибках. Табл. 3 (В) проверяет две распространённые гипотезы. Во-первых, члены БРИКС в основном ядре (Бразилия, Китай, Индия, ЮАР) не показывают дифференциального роста после 2014 г. (0,03, ст. ошибка 0,07), но демонстрируют его после 2022 г. (0,56, ст. ошибка 0,23, p = 0,017), причём этот результат определяется Индией и Китаем: речь идёт скорее о переориентации на крупные азиатские экономики, чем о «блоковом» эффекте. Во-вторых, «хабы» возможного реэкспорта (ОАЭ, Турция, Казахстан, Грузия, Азербайджан) не демонстрируют дополнительного роста суммарной торговли с Россией по сравнению с прочими партнёрами вне коалиции (−0,44, p = 0,10), хотя это ограничение связано с неполнотой данных по ОАЭ и тем, что транзитные потоки в значительной мере проходят по статье импорта.</w:t>
+        <w:t xml:space="preserve">Табл. 3 (Б) агрегирует результаты по подгруппам, принимая за базу пять оставшихся партнёров вне коалиции (Аргентина, Бразилия, Индонезия, Мексика, ЮАР). В 2014–2021 гг. значимо выросла торговля с Индией (0,26) и странами Залива и Египтом (0,34), тогда как для Китая (0,04) и «ЕАЭС и Кавказа» (0,10) сдвиг незначим, а для Турции он слабо отрицателен (−0,13; возможно, это отражает российско-турецкий торговый конфликт 2015–2016 гг.). После 2022 г. сдвиг велик для Индии (1,49, ст. ошибка 0,21) и значим для Китая (0,48, ст. ошибка 0,18); для стран Залива и Египта (0,58), Турции (0,22) и «ЕАЭС и Кавказа» (−0,23) он не отличим от нуля при больших стандартных ошибках. Табл. 3 (В) проверяет две распространённые гипотезы. Во-первых, члены БРИКС в основном ядре (Бразилия, Китай, Индия, ЮАР) не показывают дифференциального роста после 2014 г. (0,03, ст. ошибка 0,07), но демонстрируют его после 2022 г. (0,56, ст. ошибка 0,23, p = 0,017), причём этот результат определяется Индией и Китаем: речь идёт скорее о переориентации на крупные азиатские экономики, чем о «блоковом» эффекте. Во-вторых, «хабы» возможного реэкспорта (ОАЭ, Турция, Казахстан, Грузия, Азербайджан) не демонстрируют дополнительного роста суммарной торговли с Россией по сравнению с прочими партнёрами вне коалиции (−0,44, p = 0,10). Этот результат не опровергает гипотезу реэкспорта: суммарный оборот объединяет российский экспорт и импорт и не позволяет выделить поставки, направленные в Россию, а данные по ОАЭ неполны (раздел 5.4).</w:t>
       </w:r>
     </w:p>
     <w:bookmarkEnd w:id="49"/>
@@ -18073,7 +18073,7 @@
         <w:pStyle w:val="FirstParagraph"/>
       </w:pPr>
       <w:r>
-        <w:t xml:space="preserve">Эластичность торговли по расстоянию у остальных пар выборки равна −0,76 (табл. 4, рис. 6). У российских пар она существенно выше по модулю и меняется во времени: −2,04 в 2000–2013 гг. (ст. ошибка 0,18), −1,74 в 2014–2021 гг. и −1,09 в 2022–2024 гг. (0,36). Разность между последним и первым периодами равна 0,94 (95 %-й доверительный интервал: от 0,25 до 1,64). Если одновременно контролировать санкционные индикаторы, эластичность составляет −1,89, −1,78 и −1,45, а разность — 0,44 (0,07; 0,82), т. е. около половины сдвига обусловлено выпадением близких партнёров из группы коалиции (эффект состава), а остальная часть — перераспределением торговли внутри групп в пользу более далёких партнёров. В версии с парными эффектами сдвиги градиента составляют 0,33 после 2014 г. и 0,62 после 2022 г. (с санкционными индикаторами — 0,14 и 0,29).</w:t>
+        <w:t xml:space="preserve">Эластичность торговли по расстоянию у остальных пар выборки равна −0,76 (табл. 4, рис. 6). У российских пар она существенно выше по модулю и меняется во времени: −2,04 в 2000–2013 гг. (ст. ошибка 0,18), −1,74 в 2014–2021 гг. и −1,09 в 2022–2024 гг. (0,36). Разность между последним и первым периодами равна 0,94 (95 %-й доверительный интервал: от 0,25 до 1,64). Если одновременно контролировать санкционные индикаторы, эластичность составляет −1,89, −1,78 и −1,45, а разность — 0,44 (0,07; 0,82), т. е. санкционные индикаторы поглощают около 53 % сдвига (он отражает падение торговли с сравнительно близкими партнёрами коалиции), тогда как остальная часть связана с перераспределением торговли в пользу более далёких партнёров. В версии с парными эффектами сдвиг градиента составляет 0,33 после 2014 г. и дополнительно 0,62 после 2022 г. (в сумме 0,95; с санкционными индикаторами — 0,14 и 0,29, в сумме 0,42).</w:t>
       </w:r>
     </w:p>
     <w:p>
@@ -23520,7 +23520,7 @@
         </m:sSup>
       </m:oMath>
       <w:r>
-        <w:t xml:space="preserve">): эффекты «страна — год» поглощают корреляцию между парами с общей страной, поэтому кластеризация по парам консервативна. Перестановочный тест (500 случайных назначений метки «коалиция» среди российских партнёров) даёт</w:t>
+        <w:t xml:space="preserve">). Причина в том, что эффекты «страна — год» накладывают ограничения на сумму остатков по всем парам страны, поэтому скоры пар с общей страной отрицательно коррелированы, и учёт этих ковариаций уменьшает дисперсию. Кластеризация по парам их игнорирует и потому более консервативна. Перестановочный тест (500 случайных назначений метки «коалиция» среди российских партнёров) даёт</w:t>
       </w:r>
       <w:r>
         <w:t xml:space="preserve"> </w:t>
@@ -23772,7 +23772,7 @@
         <w:t xml:space="preserve"> </w:t>
       </w:r>
       <w:r>
-        <w:t xml:space="preserve">(менее 0,2 стандартной ошибки). Фактическое покрытие номинальных 95 %-х интервалов составляет 88 % и 87 %, т. е. аналитические ошибки несколько занижены; при желании ошибки можно увеличить на 20–25 %, что не меняет выводов. Для коэффициентов, определяемых одной российской парой (Республика Корея, Украина), покрытие — 42 % (Республика Корея) и от 38 % до 61 % (Украина): классический кластерный вывод к ним неприменим.</w:t>
+        <w:t xml:space="preserve">(менее 0,2 стандартной ошибки). Фактическое покрытие номинальных 95 %-х интервалов составляет 88 % и 87 %, т. е. аналитические ошибки несколько занижены; чтобы получить номинальное покрытие, их пришлось бы увеличить примерно на 30 %, что не меняет выводов. Для коэффициентов, определяемых одной российской парой (Республика Корея, Украина), покрытие — 42 % (Республика Корея) и от 38 % до 61 % (Украина): классический кластерный вывод к ним неприменим.</w:t>
       </w:r>
     </w:p>
     <w:p>
@@ -24549,7 +24549,7 @@
     </w:tbl>
     <w:bookmarkEnd w:id="58"/>
     <w:bookmarkEnd w:id="59"/>
-    <w:bookmarkStart w:id="64" w:name="обсуждение"/>
+    <w:bookmarkStart w:id="65" w:name="обсуждение"/>
     <w:p>
       <w:pPr>
         <w:pStyle w:val="Heading1"/>
@@ -24598,7 +24598,7 @@
         <w:pStyle w:val="FirstParagraph"/>
       </w:pPr>
       <w:r>
-        <w:t xml:space="preserve">Результаты рисуют согласованную картину перераспределения. Во-первых, рост торговли после 2022 г. сосредоточен не в «блоке БРИКС» как таковом, а в крупных азиатских экономиках (Индия, Китай) и странах Персидского залива (рис. 5, табл. 3): дифференциальный рост БРИКС-партнёров после 2022 г. определяется Индией и Китаем, тогда как Бразилия и ЮАР показывают умеренные значения, а ОАЭ и Саудовская Аравия — одни из наибольших относительных приростов, не будучи (до 2024 г.) членами БРИКС. Это существенно корректирует вывод исходной спецификации о многократном «усилении» торговли внутри блока: он оказывается следствием опущенного размера экономик, а не блоковой принадлежности. Во-вторых, градиент расстояния российской торговли уплощился: эластичность по расстоянию уменьшилась по модулю с −2,04 до −1,09, а средневзвешенное расстояние до партнёров выросло на 1,1 тыс. км (с 3,6 до 4,7). Около половины этого сдвига обусловлено выпадением близких партнёров (эффект состава), остальное — перераспределением в пользу более далёких. В-третьих, перераспределение не было полным: по оценке ориентира переориентация компенсировала около 75 % потерь торговли с коалицией и Украиной в 2022–2024 гг., а суммарный оборот остался ниже ориентира. Более длинные маршруты означают более высокие транспортные и транзакционные издержки и, как показывает литература по нефти [Babina et al., 2023], более низкие цены реализации; объёмы оборота эти потери не отражают, поэтому оценка «компенсации» в стоимостном выражении — верхняя граница в терминах благосостояния.</w:t>
+        <w:t xml:space="preserve">Результаты рисуют согласованную картину перераспределения. Во-первых, рост торговли после 2022 г. сосредоточен не в «блоке БРИКС» как таковом, а в крупных азиатских экономиках (Индия, Китай) и странах Персидского залива (рис. 5, табл. 3): дифференциальный рост БРИКС-партнёров после 2022 г. определяется Индией и Китаем, тогда как Бразилия и ЮАР показывают умеренные значения, а ОАЭ и Саудовская Аравия — одни из наибольших относительных приростов, хотя ОАЭ вошли в БРИКС лишь в 2024 г., а Саудовская Аравия в принятой кодировке членом объединения не считается. Это существенно корректирует вывод исходной спецификации о многократном «усилении» торговли внутри блока: он оказывается следствием опущенного размера экономик, а не блоковой принадлежности. Во-вторых, градиент расстояния российской торговли уплощился: эластичность по расстоянию уменьшилась по модулю с −2,04 до −1,09, а средневзвешенное расстояние до партнёров выросло на 1,1 тыс. км (с 3,6 до 4,7). Около 53 % этого сдвига поглощается индикаторами санкций, т. е. отражает падение торговли с сравнительно близкими партнёрами коалиции; остальное связано с перераспределением торговли в пользу более далёких партнёров. В-третьих, перераспределение не было полным: по оценке ориентира переориентация компенсировала около 75 % потерь торговли с коалицией и Украиной в 2022–2024 гг., а суммарный оборот остался ниже ориентира. Более длинные маршруты означают более высокие транспортные и транзакционные издержки и, как показывает литература по российской нефти [Babina et al., 2023], более низкие цены реализации; оборот в текущих ценах этих потерь не отражает, поэтому доля «компенсации», рассчитанная по обороту, завышает компенсацию в терминах благосостояния.</w:t>
       </w:r>
     </w:p>
     <w:p>
@@ -24606,7 +24606,7 @@
         <w:pStyle w:val="BodyText"/>
       </w:pPr>
       <w:r>
-        <w:t xml:space="preserve">Результаты для «хабов» неоднозначны. Исследования [Chupilkin et al., 2023] показывают, что часть поставок из стран коалиции в Россию была перенаправлена через страны Кавказа и Центральной Азии. В нашей постановке суммарная торговля «хабов» (ОАЭ, Турция, Казахстан, Грузия, Азербайджан) с Россией не растёт заметно быстрее, чем с другими партнёрами вне коалиции (табл. 3 В). Однако этот результат не опровергает наличия реэкспорта: суммарные данные не позволяют разделить товары по стране происхождения, а данные по ОАЭ неполны. Если часть роста «прочих» партнёров — реэкспорт товаров стран коалиции, то фактическое снижение торговли</w:t>
+        <w:t xml:space="preserve">Результаты для «хабов» неоднозначны. В работе [Chupilkin et al., 2026] показано, что часть поставок из стран, введших ограничения, в Россию была перенаправлена через страны Кавказа и Центральной Азии. В нашей постановке суммарная торговля «хабов» (ОАЭ, Турция, Казахстан, Грузия, Азербайджан) с Россией не растёт заметно быстрее, чем с другими партнёрами вне коалиции (табл. 3 В). Однако этот результат не опровергает наличия реэкспорта: суммарные данные не позволяют разделить товары по стране происхождения, а данные по ОАЭ неполны. Если часть роста «прочих» партнёров — реэкспорт товаров стран коалиции, то фактическое снижение торговли</w:t>
       </w:r>
       <w:r>
         <w:t xml:space="preserve"> </w:t>
@@ -24639,13 +24639,13 @@
       </w:r>
     </w:p>
     <w:bookmarkEnd w:id="61"/>
-    <w:bookmarkStart w:id="62" w:name="ограничения"/>
+    <w:bookmarkStart w:id="62" w:name="соотнесение-с-литературой"/>
     <w:p>
       <w:pPr>
         <w:pStyle w:val="Heading2"/>
       </w:pPr>
       <w:r>
-        <w:t xml:space="preserve">5.3. Ограничения</w:t>
+        <w:t xml:space="preserve">5.3. Соотнесение с литературой</w:t>
       </w:r>
     </w:p>
     <w:p>
@@ -24653,6 +24653,32 @@
         <w:pStyle w:val="FirstParagraph"/>
       </w:pPr>
       <w:r>
+        <w:t xml:space="preserve">Прямое сопоставление величин осложнено различиями в данных, выборках и определениях санкций, поэтому ниже сравниваются главным образом качественные выводы. Во-первых, постепенное нарастание эффекта режима 2014 г. (рис. 3) согласуется с выводом [Crozet, Hinz, 2020] о том, что потери торговли в 2014–2015 гг. были связаны в значительной мере не с прямыми ответными ограничениями России, а с ростом странового риска, затрагивающего международные операции с Россией; в нашей агрегированной постановке каналы не различимы, и это сопоставление остаётся гипотезой. Во-вторых, в [Yalcin et al., 2025] на базе данных о санкциях получены значимые, но сравнительно небольшие средние эффекты санкций против России и сильная гетерогенность по странам-инициаторам. В нашей постановке различия между подгруппами коалиции существенны для режима 2014 г. и заметно слабее для режима 2022 г. (табл. 3 А), а оценка эффекта режима 2022 г. по модулю заметно превышает «сравнительно небольшие» средние эффекты, о которых сообщают эти авторы. Возможные причины расхождения — различия в определении санкций (одна группа «коалиция» против интенсивностей санкций по странам-инициаторам), в выборке стран и периоде, использование суммарной, а не направленной торговли и то, что наши оценки измеряют эффект относительно торговли России с прочими партнёрами, которая росла; без единой выборки и единого определения санкций эти объяснения проверить нельзя, и наши относительные оценки следует рассматривать как верхнюю границу эффекта на торговлю с коалицией.</w:t>
+      </w:r>
+    </w:p>
+    <w:p>
+      <w:pPr>
+        <w:pStyle w:val="BodyText"/>
+      </w:pPr>
+      <w:r>
+        <w:t xml:space="preserve">В-третьих, вывод о неполной компенсации потерь за счёт переориентации согласуется с результатами, полученными на товарных и транзакционных данных: перенаправление через третьи страны и замещение поставками из Китая компенсируют лишь часть падения прямого импорта из стран-инициаторов [Egorov et al., 2025; Chupilkin et al., 2025; Sjöholm, 2026]. Наш результат о том, что рост торговли определяется преимущественно Индией и Китаем, согласуется с выводом [Yalcin et al., 2025] о снижении прямых торговых издержек России с Индией, Китаем и Турцией; для Турции мы значимого дифференциального роста после 2022 г. не обнаруживаем (табл. 3 Б). Наконец, наши оценки не противоречат выводу [Izotov, 2025] о том, что переориентация торговли на страны — члены ВТО и восстановление мировой торговли компенсировали значительную часть ущерба: гравитационный ориентир показывает компенсацию порядка трёх четвертей потерь торговли с коалицией и Украиной в 2022–2024 гг., хотя и при заметной неточности ориентира.</w:t>
+      </w:r>
+    </w:p>
+    <w:bookmarkEnd w:id="62"/>
+    <w:bookmarkStart w:id="63" w:name="ограничения"/>
+    <w:p>
+      <w:pPr>
+        <w:pStyle w:val="Heading2"/>
+      </w:pPr>
+      <w:r>
+        <w:t xml:space="preserve">5.4. Ограничения</w:t>
+      </w:r>
+    </w:p>
+    <w:p>
+      <w:pPr>
+        <w:pStyle w:val="FirstParagraph"/>
+      </w:pPr>
+      <w:r>
         <w:rPr>
           <w:iCs/>
           <w:i/>
@@ -24756,14 +24782,14 @@
         <w:t xml:space="preserve">Панель заканчивается 2024 г.; обновление до 2025 г. и верификация 2022–2024 гг. по первичным источникам требуют повторной выгрузки статистики (процедура описана в репозитории).</w:t>
       </w:r>
     </w:p>
-    <w:bookmarkEnd w:id="62"/>
-    <w:bookmarkStart w:id="63" w:name="направления-дальнейших-исследований"/>
+    <w:bookmarkEnd w:id="63"/>
+    <w:bookmarkStart w:id="64" w:name="направления-дальнейших-исследований"/>
     <w:p>
       <w:pPr>
         <w:pStyle w:val="Heading2"/>
       </w:pPr>
       <w:r>
-        <w:t xml:space="preserve">5.4. Направления дальнейших исследований</w:t>
+        <w:t xml:space="preserve">5.5. Направления дальнейших исследований</w:t>
       </w:r>
     </w:p>
     <w:p>
@@ -24771,12 +24797,12 @@
         <w:pStyle w:val="FirstParagraph"/>
       </w:pPr>
       <w:r>
-        <w:t xml:space="preserve">Естественные продолжения: (i) оценка на направленных потоках с раздельным анализом экспорта и импорта; (ii) переход к товарным группам и учёт реэкспорта по стране происхождения; (iii) использование интенсивностей санкций из Global Sanctions Data Base [Syropoulos et al., 2024] и показателей геополитической близости [Campos et al., 2023]; (iv) общеравновесные контрфактуалы в структурной модели, позволяющие оценить абсолютный эффект на благосостояние.</w:t>
+        <w:t xml:space="preserve">Естественные продолжения: (i) оценка на направленных потоках с раздельным анализом экспорта и импорта; (ii) переход к товарным группам и учёт реэкспорта по стране происхождения; (iii) использование интенсивностей санкций из Global Sanctions Data Base [Syropoulos et al., 2024; Yalcin et al., 2025] и показателей геополитической близости [Campos et al., 2023]; (iv) общеравновесные контрфактуалы в структурной модели, позволяющие оценить абсолютный эффект на благосостояние.</w:t>
       </w:r>
     </w:p>
-    <w:bookmarkEnd w:id="63"/>
     <w:bookmarkEnd w:id="64"/>
-    <w:bookmarkStart w:id="65" w:name="заключение"/>
+    <w:bookmarkEnd w:id="65"/>
+    <w:bookmarkStart w:id="66" w:name="заключение"/>
     <w:p>
       <w:pPr>
         <w:pStyle w:val="Heading1"/>
@@ -24877,8 +24903,8 @@
         <w:t xml:space="preserve">Данные, код (Python, gretl) и результаты размещены в репозитории: [URL репозитория].</w:t>
       </w:r>
     </w:p>
-    <w:bookmarkEnd w:id="65"/>
-    <w:bookmarkStart w:id="66" w:name="литература"/>
+    <w:bookmarkEnd w:id="66"/>
+    <w:bookmarkStart w:id="67" w:name="литература"/>
     <w:p>
       <w:pPr>
         <w:pStyle w:val="Heading1"/>
@@ -25040,7 +25066,7 @@
         <w:pStyle w:val="Compact"/>
       </w:pPr>
       <w:r>
-        <w:t xml:space="preserve">Babina T., Hilgenstock B., Itskhoki O., Mironov M., Ribakova E. Assessing the impact of international sanctions on Russian oil exports. SSRN Working Paper. 2023.</w:t>
+        <w:t xml:space="preserve">Babina T., Hilgenstock B., Itskhoki O., Mironov M., Ribakova E. Assessing the impact of international sanctions on Russian oil exports. CEPR Discussion Paper No. 17957. 2023.</w:t>
       </w:r>
     </w:p>
     <w:p>
@@ -25136,7 +25162,7 @@
         <w:pStyle w:val="Compact"/>
       </w:pPr>
       <w:r>
-        <w:t xml:space="preserve">Chupilkin M., Javorcik B., Plekhanov A. The Eurasian roundabout: trade flows into Russia through the Caucasus and Central Asia. EBRD Working Paper No. 276. 2023.</w:t>
+        <w:t xml:space="preserve">Chupilkin M., Javorcik B., Peeva A., Plekhanov A. Economic sanctions and intermediated trade // AEA Papers and Proceedings. 2025. Vol. 115. P. 568–572.</w:t>
       </w:r>
     </w:p>
     <w:p>
@@ -25148,7 +25174,7 @@
         <w:pStyle w:val="Compact"/>
       </w:pPr>
       <w:r>
-        <w:t xml:space="preserve">Conte M., Cotterlaz P., Mayer T. The CEPII Gravity database. CEPII Working Paper No. 2022-05. 2022.</w:t>
+        <w:t xml:space="preserve">Chupilkin M., Javorcik B., Plekhanov A. The Eurasian roundabout: trade flows into Russia through the Caucasus and Central Asia // European Economic Review. 2026. Vol. 187. Art. 105340.</w:t>
       </w:r>
     </w:p>
     <w:p>
@@ -25160,7 +25186,7 @@
         <w:pStyle w:val="Compact"/>
       </w:pPr>
       <w:r>
-        <w:t xml:space="preserve">Correia S., Guimarães P., Zylkin T. Fast Poisson estimation with high-dimensional fixed effects // Stata Journal. 2020. Vol. 20. No. 1. P. 95–115.</w:t>
+        <w:t xml:space="preserve">Conte M., Cotterlaz P., Mayer T. The CEPII Gravity database. CEPII Working Paper No. 2022-05. 2022.</w:t>
       </w:r>
     </w:p>
     <w:p>
@@ -25172,7 +25198,7 @@
         <w:pStyle w:val="Compact"/>
       </w:pPr>
       <w:r>
-        <w:t xml:space="preserve">Crozet M., Hinz J. Friendly fire: the trade impact of the Russia sanctions and counter-sanctions // Economic Policy. 2020. Vol. 35. No. 101. P. 97–146.</w:t>
+        <w:t xml:space="preserve">Correia S., Guimarães P., Zylkin T. Fast Poisson estimation with high-dimensional fixed effects // Stata Journal. 2020. Vol. 20. No. 1. P. 95–115.</w:t>
       </w:r>
     </w:p>
     <w:p>
@@ -25184,7 +25210,7 @@
         <w:pStyle w:val="Compact"/>
       </w:pPr>
       <w:r>
-        <w:t xml:space="preserve">Crozet M., Hinz J., Stammann A., Wanner J. Worth the pain? Firms' exporting behaviour to countries under sanctions // European Economic Review. 2021. Vol. 134. Art. 103683.</w:t>
+        <w:t xml:space="preserve">Crozet M., Hinz J. Friendly fire: the trade impact of the Russia sanctions and counter-sanctions // Economic Policy. 2020. Vol. 35. No. 101. P. 97–146.</w:t>
       </w:r>
     </w:p>
     <w:p>
@@ -25196,7 +25222,7 @@
         <w:pStyle w:val="Compact"/>
       </w:pPr>
       <w:r>
-        <w:t xml:space="preserve">Deardorff A. V. Determinants of bilateral trade: does gravity work in a neoclassical world? // The Regionalization of the World Economy / ed. J. A. Frankel. Chicago: University of Chicago Press, 1998. P. 7–32.</w:t>
+        <w:t xml:space="preserve">Crozet M., Hinz J., Stammann A., Wanner J. Worth the pain? Firms' exporting behaviour to countries under sanctions // European Economic Review. 2021. Vol. 134. Art. 103683.</w:t>
       </w:r>
     </w:p>
     <w:p>
@@ -25208,7 +25234,7 @@
         <w:pStyle w:val="Compact"/>
       </w:pPr>
       <w:r>
-        <w:t xml:space="preserve">Disdier A.-C., Head K. The puzzling persistence of the distance effect on bilateral trade // Review of Economics and Statistics. 2008. Vol. 90. No. 1. P. 37–48.</w:t>
+        <w:t xml:space="preserve">Deardorff A. V. Determinants of bilateral trade: does gravity work in a neoclassical world? // The Regionalization of the World Economy / ed. J. A. Frankel. Chicago: University of Chicago Press, 1998. P. 7–32.</w:t>
       </w:r>
     </w:p>
     <w:p>
@@ -25220,7 +25246,7 @@
         <w:pStyle w:val="Compact"/>
       </w:pPr>
       <w:r>
-        <w:t xml:space="preserve">Dreger C., Kholodilin K. A., Ulbricht D., Fidrmuc J. Between the hammer and the anvil: the impact of economic sanctions and oil prices on Russia's ruble // Journal of Comparative Economics. 2016. Vol. 44. No. 2. P. 295–308.</w:t>
+        <w:t xml:space="preserve">Disdier A.-C., Head K. The puzzling persistence of the distance effect on bilateral trade // Review of Economics and Statistics. 2008. Vol. 90. No. 1. P. 37–48.</w:t>
       </w:r>
     </w:p>
     <w:p>
@@ -25232,7 +25258,7 @@
         <w:pStyle w:val="Compact"/>
       </w:pPr>
       <w:r>
-        <w:t xml:space="preserve">Eaton J., Kortum S. Technology, geography, and trade // Econometrica. 2002. Vol. 70. No. 5. P. 1741–1779.</w:t>
+        <w:t xml:space="preserve">Dreger C., Kholodilin K. A., Ulbricht D., Fidrmuc J. Between the hammer and the anvil: the impact of economic sanctions and oil prices on Russia's ruble // Journal of Comparative Economics. 2016. Vol. 44. No. 2. P. 295–308.</w:t>
       </w:r>
     </w:p>
     <w:p>
@@ -25244,7 +25270,7 @@
         <w:pStyle w:val="Compact"/>
       </w:pPr>
       <w:r>
-        <w:t xml:space="preserve">Egger P., Larch M. Interdependent preferential trade agreement memberships: an empirical analysis // Journal of International Economics. 2008. Vol. 76. No. 2. P. 384–399.</w:t>
+        <w:t xml:space="preserve">Eaton J., Kortum S. Technology, geography, and trade // Econometrica. 2002. Vol. 70. No. 5. P. 1741–1779.</w:t>
       </w:r>
     </w:p>
     <w:p>
@@ -25256,7 +25282,7 @@
         <w:pStyle w:val="Compact"/>
       </w:pPr>
       <w:r>
-        <w:t xml:space="preserve">Fajgelbaum P. D., Khandelwal A. K. The economic impacts of the US–China trade war // Annual Review of Economics. 2022. Vol. 14. P. 205–228.</w:t>
+        <w:t xml:space="preserve">Egger P., Larch M. Interdependent preferential trade agreement memberships: an empirical analysis // Journal of International Economics. 2008. Vol. 76. No. 2. P. 384–399.</w:t>
       </w:r>
     </w:p>
     <w:p>
@@ -25268,7 +25294,7 @@
         <w:pStyle w:val="Compact"/>
       </w:pPr>
       <w:r>
-        <w:t xml:space="preserve">Fally T. Structural gravity and fixed effects // Journal of International Economics. 2015. Vol. 97. No. 1. P. 76–85.</w:t>
+        <w:t xml:space="preserve">Egorov K., Korovkin V., Makarin A., Nigmatulina D. Trade sanctions. Universitat Pompeu Fabra, Economics Working Paper No. 1920. 2025.</w:t>
       </w:r>
     </w:p>
     <w:p>
@@ -25280,7 +25306,7 @@
         <w:pStyle w:val="Compact"/>
       </w:pPr>
       <w:r>
-        <w:t xml:space="preserve">Felbermayr G., Kirilakha A., Syropoulos C., Yalcin E., Yotov Y. V. (2020a) The Global Sanctions Data Base // European Economic Review. 2020. Vol. 129. Art. 103561.</w:t>
+        <w:t xml:space="preserve">Fajgelbaum P. D., Khandelwal A. K. The economic impacts of the US–China trade war // Annual Review of Economics. 2022. Vol. 14. P. 205–228.</w:t>
       </w:r>
     </w:p>
     <w:p>
@@ -25292,7 +25318,7 @@
         <w:pStyle w:val="Compact"/>
       </w:pPr>
       <w:r>
-        <w:t xml:space="preserve">Felbermayr G., Syropoulos C., Yalcin E., Yotov Y. V. (2020b) On the effects of sanctions on trade and welfare: new evidence based on structural gravity and a new database. CESifo Working Paper No. 8728. 2020.</w:t>
+        <w:t xml:space="preserve">Fally T. Structural gravity and fixed effects // Journal of International Economics. 2015. Vol. 97. No. 1. P. 76–85.</w:t>
       </w:r>
     </w:p>
     <w:p>
@@ -25304,7 +25330,7 @@
         <w:pStyle w:val="Compact"/>
       </w:pPr>
       <w:r>
-        <w:t xml:space="preserve">Felbermayr G., Morgan T. C., Syropoulos C., Yotov Y. V. Understanding economic sanctions: interdisciplinary perspectives on theory and evidence // European Economic Review. 2021. Vol. 135. Art. 103720.</w:t>
+        <w:t xml:space="preserve">Felbermayr G., Kirilakha A., Syropoulos C., Yalcin E., Yotov Y. V. The Global Sanctions Data Base // European Economic Review. 2020. Vol. 129. Art. 103561.</w:t>
       </w:r>
     </w:p>
     <w:p>
@@ -25316,7 +25342,7 @@
         <w:pStyle w:val="Compact"/>
       </w:pPr>
       <w:r>
-        <w:t xml:space="preserve">Gaulier G., Zignago S. BACI: International trade database at the product-level. The 1994–2007 version. CEPII Working Paper No. 2010-23. 2010.</w:t>
+        <w:t xml:space="preserve">Felbermayr G., Morgan T. C., Syropoulos C., Yotov Y. V. Understanding economic sanctions: interdisciplinary perspectives on theory and evidence // European Economic Review. 2021. Vol. 135. Art. 103720.</w:t>
       </w:r>
     </w:p>
     <w:p>
@@ -25328,7 +25354,7 @@
         <w:pStyle w:val="Compact"/>
       </w:pPr>
       <w:r>
-        <w:t xml:space="preserve">Gopinath G., Gourinchas P.-O., Presbitero A. F., Topalova P. Changing global linkages: a new Cold War? IMF Working Paper No. 24/76. 2024.</w:t>
+        <w:t xml:space="preserve">Felbermayr G., Syropoulos C., Yalcin E., Yotov Y. V. On the effects of sanctions on trade and welfare: new evidence based on structural gravity and a new database. CESifo Working Paper No. 7728. 2019.</w:t>
       </w:r>
     </w:p>
     <w:p>
@@ -25340,7 +25366,7 @@
         <w:pStyle w:val="Compact"/>
       </w:pPr>
       <w:r>
-        <w:t xml:space="preserve">Gurvich E., Prilepskiy I. The impact of financial sanctions on the Russian economy // Russian Journal of Economics. 2015. Vol. 1. No. 4. P. 359–385.</w:t>
+        <w:t xml:space="preserve">Gaulier G., Zignago S. BACI: International trade database at the product-level. The 1994–2007 version. CEPII Working Paper No. 2010-23. 2010.</w:t>
       </w:r>
     </w:p>
     <w:p>
@@ -25352,7 +25378,7 @@
         <w:pStyle w:val="Compact"/>
       </w:pPr>
       <w:r>
-        <w:t xml:space="preserve">Head K., Mayer T. Gravity equations: workhorse, toolkit, and cookbook // Handbook of International Economics. Vol. 4 / eds. G. Gopinath, E. Helpman, K. Rogoff. Amsterdam: Elsevier, 2014. P. 131–195.</w:t>
+        <w:t xml:space="preserve">Gopinath G., Gourinchas P.-O., Presbitero A. F., Topalova P. Changing global linkages: a new Cold War? // Journal of International Economics. 2025. Vol. 153. Art. 104042.</w:t>
       </w:r>
     </w:p>
     <w:p>
@@ -25364,7 +25390,7 @@
         <w:pStyle w:val="Compact"/>
       </w:pPr>
       <w:r>
-        <w:t xml:space="preserve">Hinz J., Monastyrenko E. Bearing the cost of politics: consumer prices and welfare in Russia // Journal of International Economics. 2022. Vol. 137. Art. 103581.</w:t>
+        <w:t xml:space="preserve">Gurvich E., Prilepskiy I. The impact of financial sanctions on the Russian economy // Russian Journal of Economics. 2015. Vol. 1. No. 4. P. 359–385.</w:t>
       </w:r>
     </w:p>
     <w:p>
@@ -25376,7 +25402,7 @@
         <w:pStyle w:val="Compact"/>
       </w:pPr>
       <w:r>
-        <w:t xml:space="preserve">Hufbauer G. C., Schott J. J., Elliott K. A., Oegg B. Economic Sanctions Reconsidered. 3rd ed. Washington: Peterson Institute for International Economics, 2007.</w:t>
+        <w:t xml:space="preserve">Head K., Mayer T. Gravity equations: workhorse, toolkit, and cookbook // Handbook of International Economics. Vol. 4 / eds. G. Gopinath, E. Helpman, K. Rogoff. Amsterdam: Elsevier, 2014. P. 131–195.</w:t>
       </w:r>
     </w:p>
     <w:p>
@@ -25388,7 +25414,7 @@
         <w:pStyle w:val="Compact"/>
       </w:pPr>
       <w:r>
-        <w:t xml:space="preserve">Itskhoki O., Mukhin D. Sanctions and the exchange rate. NBER Working Paper No. 30009. 2022.</w:t>
+        <w:t xml:space="preserve">Hinz J., Monastyrenko E. Bearing the cost of politics: consumer prices and welfare in Russia // Journal of International Economics. 2022. Vol. 137. Art. 103581.</w:t>
       </w:r>
     </w:p>
     <w:p>
@@ -25400,7 +25426,7 @@
         <w:pStyle w:val="Compact"/>
       </w:pPr>
       <w:r>
-        <w:t xml:space="preserve">Javorcik B., Kitzmueller L., Schweiger H., Yıldırım M. A. Economic costs of friend-shoring. EBRD Working Paper No. 274. 2022.</w:t>
+        <w:t xml:space="preserve">Hufbauer G. C., Schott J. J., Elliott K. A., Oegg B. Economic Sanctions Reconsidered. 3rd ed. Washington: Peterson Institute for International Economics, 2007.</w:t>
       </w:r>
     </w:p>
     <w:p>
@@ -25412,7 +25438,7 @@
         <w:pStyle w:val="Compact"/>
       </w:pPr>
       <w:r>
-        <w:t xml:space="preserve">Kholodilin K. A., Netšunajev A. Crimea and punishment: the impact of sanctions on Russian and European economies // Baltic Journal of Economics. 2019. Vol. 19. No. 1. P. 39–51.</w:t>
+        <w:t xml:space="preserve">Itskhoki O., Mukhin D. Sanctions and the exchange rate. NBER Working Paper No. 30009. 2022.</w:t>
       </w:r>
     </w:p>
     <w:p>
@@ -25424,7 +25450,7 @@
         <w:pStyle w:val="Compact"/>
       </w:pPr>
       <w:r>
-        <w:t xml:space="preserve">Korhonen I., Simola H., Solanko L. Sanctions, counter-sanctions and Russia — effects on economy, trade and finance. BOFIT Policy Brief No. 4/2018. Helsinki: Bank of Finland, 2018.</w:t>
+        <w:t xml:space="preserve">Izotov D. A. Russia's foreign trade in raw materials and industrial goods: the impact of integration agreements and sanctions // Baltic Region. 2025. Vol. 17. No. 4. P. 84–106.</w:t>
       </w:r>
     </w:p>
     <w:p>
@@ -25436,7 +25462,7 @@
         <w:pStyle w:val="Compact"/>
       </w:pPr>
       <w:r>
-        <w:t xml:space="preserve">Linder S. B. An Essay on Trade and Transformation. Stockholm: Almqvist &amp; Wiksell, 1961.</w:t>
+        <w:t xml:space="preserve">Javorcik B., Kitzmueller L., Schweiger H., Yıldırım M. A. Economic costs of friend-shoring. CEPR Discussion Paper No. 17764. 2022.</w:t>
       </w:r>
     </w:p>
     <w:p>
@@ -25448,7 +25474,7 @@
         <w:pStyle w:val="Compact"/>
       </w:pPr>
       <w:r>
-        <w:t xml:space="preserve">Linnemann H. An Econometric Study of International Trade Flows. Amsterdam: North-Holland, 1966.</w:t>
+        <w:t xml:space="preserve">Kholodilin K. A., Netšunajev A. Crimea and punishment: the impact of sanctions on Russian and European economies // Baltic Journal of Economics. 2019. Vol. 19. No. 1. P. 39–51.</w:t>
       </w:r>
     </w:p>
     <w:p>
@@ -25460,7 +25486,7 @@
         <w:pStyle w:val="Compact"/>
       </w:pPr>
       <w:r>
-        <w:t xml:space="preserve">Lissovolik B., Lissovolik Y. Russia and the WTO: the "gravity" of outsider status // IMF Staff Papers. 2006. Vol. 53. No. 1. P. 1–24.</w:t>
+        <w:t xml:space="preserve">Korhonen I., Simola H., Solanko L. Sanctions, counter-sanctions and Russia — effects on economy, trade and finance. BOFIT Policy Brief No. 4/2018. Helsinki: Bank of Finland, 2018.</w:t>
       </w:r>
     </w:p>
     <w:p>
@@ -25472,7 +25498,7 @@
         <w:pStyle w:val="Compact"/>
       </w:pPr>
       <w:r>
-        <w:t xml:space="preserve">Mayer T., Zignago S. Notes on CEPII's distances measures: the GeoDist database. CEPII Working Paper No. 2011-25. 2011.</w:t>
+        <w:t xml:space="preserve">Linder S. B. An Essay on Trade and Transformation. Stockholm: Almqvist &amp; Wiksell, 1961.</w:t>
       </w:r>
     </w:p>
     <w:p>
@@ -25484,7 +25510,7 @@
         <w:pStyle w:val="Compact"/>
       </w:pPr>
       <w:r>
-        <w:t xml:space="preserve">Mulder N. The Economic Weapon: The Rise of Sanctions as a Tool of Modern War. New Haven: Yale University Press, 2022.</w:t>
+        <w:t xml:space="preserve">Linnemann H. An Econometric Study of International Trade Flows. Amsterdam: North-Holland, 1966.</w:t>
       </w:r>
     </w:p>
     <w:p>
@@ -25496,7 +25522,7 @@
         <w:pStyle w:val="Compact"/>
       </w:pPr>
       <w:r>
-        <w:t xml:space="preserve">Neuenkirch M., Neumeier F. The impact of UN and US economic sanctions on GDP growth // European Journal of Political Economy. 2015. Vol. 40. P. 110–125.</w:t>
+        <w:t xml:space="preserve">Lissovolik B., Lissovolik Y. Russia and the WTO: the "gravity" of outsider status // IMF Staff Papers. 2006. Vol. 53. No. 1. P. 1–24.</w:t>
       </w:r>
     </w:p>
     <w:p>
@@ -25508,7 +25534,7 @@
         <w:pStyle w:val="Compact"/>
       </w:pPr>
       <w:r>
-        <w:t xml:space="preserve">Pöyhönen P. A tentative model for the volume of trade between countries // Weltwirtschaftliches Archiv. 1963. Bd. 90. S. 93–100.</w:t>
+        <w:t xml:space="preserve">Mayer T., Zignago S. Notes on CEPII's distances measures: the GeoDist database. CEPII Working Paper No. 2011-25. 2011.</w:t>
       </w:r>
     </w:p>
     <w:p>
@@ -25520,7 +25546,7 @@
         <w:pStyle w:val="Compact"/>
       </w:pPr>
       <w:r>
-        <w:t xml:space="preserve">Santos Silva J. M. C., Tenreyro S. The log of gravity // Review of Economics and Statistics. 2006. Vol. 88. No. 4. P. 641–658.</w:t>
+        <w:t xml:space="preserve">Mulder N. The Economic Weapon: The Rise of Sanctions as a Tool of Modern War. New Haven: Yale University Press, 2022.</w:t>
       </w:r>
     </w:p>
     <w:p>
@@ -25532,7 +25558,7 @@
         <w:pStyle w:val="Compact"/>
       </w:pPr>
       <w:r>
-        <w:t xml:space="preserve">Santos Silva J. M. C., Tenreyro S. Further simulation evidence on the performance of the Poisson pseudo-maximum likelihood estimator // Economics Letters. 2011. Vol. 112. No. 2. P. 220–222.</w:t>
+        <w:t xml:space="preserve">Nagengast A. J., Yotov Y. V. Staggered difference-in-differences in gravity settings: revisiting the effects of trade agreements // American Economic Journal: Applied Economics. 2025. Vol. 17. No. 1. P. 271–296.</w:t>
       </w:r>
     </w:p>
     <w:p>
@@ -25544,7 +25570,7 @@
         <w:pStyle w:val="Compact"/>
       </w:pPr>
       <w:r>
-        <w:t xml:space="preserve">Santos Silva J. M. C., Tenreyro S. The log of gravity at 15 // Portuguese Economic Journal. 2022. Vol. 21. P. 423–437.</w:t>
+        <w:t xml:space="preserve">Neuenkirch M., Neumeier F. The impact of UN and US economic sanctions on GDP growth // European Journal of Political Economy. 2015. Vol. 40. P. 110–125.</w:t>
       </w:r>
     </w:p>
     <w:p>
@@ -25556,7 +25582,7 @@
         <w:pStyle w:val="Compact"/>
       </w:pPr>
       <w:r>
-        <w:t xml:space="preserve">Syropoulos C., Felbermayr G., Kirilakha A., Yalcin E., Yotov Y. V. The Global Sanctions Data Base — Release 3: COVID-19, Russia, and multilateral sanctions // Review of International Economics. 2024. Vol. 32. No. 1. P. 12–48.</w:t>
+        <w:t xml:space="preserve">Pöyhönen P. A tentative model for the volume of trade between countries // Weltwirtschaftliches Archiv. 1963. Bd. 90. S. 93–100.</w:t>
       </w:r>
     </w:p>
     <w:p>
@@ -25568,7 +25594,7 @@
         <w:pStyle w:val="Compact"/>
       </w:pPr>
       <w:r>
-        <w:t xml:space="preserve">Tarr D. G. The Eurasian Economic Union of Russia, Belarus, Kazakhstan, Armenia, and the Kyrgyz Republic: is customs union membership welfare enhancing? // Journal of Asian Economics. 2016. Vol. 45. P. 1–22.</w:t>
+        <w:t xml:space="preserve">Santos Silva J. M. C., Tenreyro S. The log of gravity // Review of Economics and Statistics. 2006. Vol. 88. No. 4. P. 641–658.</w:t>
       </w:r>
     </w:p>
     <w:p>
@@ -25580,7 +25606,7 @@
         <w:pStyle w:val="Compact"/>
       </w:pPr>
       <w:r>
-        <w:t xml:space="preserve">Tinbergen J. Shaping the World Economy: Suggestions for an International Economic Policy. New York: Twentieth Century Fund, 1962.</w:t>
+        <w:t xml:space="preserve">Santos Silva J. M. C., Tenreyro S. Further simulation evidence on the performance of the Poisson pseudo-maximum likelihood estimator // Economics Letters. 2011. Vol. 112. No. 2. P. 220–222.</w:t>
       </w:r>
     </w:p>
     <w:p>
@@ -25592,7 +25618,7 @@
         <w:pStyle w:val="Compact"/>
       </w:pPr>
       <w:r>
-        <w:t xml:space="preserve">Weidner M., Zylkin T. Bias and consistency in three-way gravity models // Journal of International Economics. 2021. Vol. 132. Art. 103513.</w:t>
+        <w:t xml:space="preserve">Santos Silva J. M. C., Tenreyro S. The log of gravity at 15 // Portuguese Economic Journal. 2022. Vol. 21. P. 423–437.</w:t>
       </w:r>
     </w:p>
     <w:p>
@@ -25604,7 +25630,7 @@
         <w:pStyle w:val="Compact"/>
       </w:pPr>
       <w:r>
-        <w:t xml:space="preserve">Yotov Y. V. Gravity at sixty: the workhorse model of trade. CESifo Working Paper No. 9584. 2022.</w:t>
+        <w:t xml:space="preserve">Sjöholm F. Chinese export gains, EU export losses, and Russian import reorientation after the 2022 sanctions. IFN Working Paper No. 1560. Stockholm: Research Institute of Industrial Economics, 2026.</w:t>
       </w:r>
     </w:p>
     <w:p>
@@ -25616,6 +25642,78 @@
         <w:pStyle w:val="Compact"/>
       </w:pPr>
       <w:r>
+        <w:t xml:space="preserve">Syropoulos C., Felbermayr G., Kirilakha A., Yalcin E., Yotov Y. V. The Global Sanctions Data Base — Release 3: COVID-19, Russia, and multilateral sanctions // Review of International Economics. 2024. Vol. 32. No. 1. P. 12–48.</w:t>
+      </w:r>
+    </w:p>
+    <w:p>
+      <w:pPr>
+        <w:numPr>
+          <w:ilvl w:val="0"/>
+          <w:numId w:val="1001"/>
+        </w:numPr>
+        <w:pStyle w:val="Compact"/>
+      </w:pPr>
+      <w:r>
+        <w:t xml:space="preserve">Tarr D. G. The Eurasian Economic Union of Russia, Belarus, Kazakhstan, Armenia, and the Kyrgyz Republic: is customs union membership welfare enhancing? // Journal of Asian Economics. 2016. Vol. 45. P. 1–22.</w:t>
+      </w:r>
+    </w:p>
+    <w:p>
+      <w:pPr>
+        <w:numPr>
+          <w:ilvl w:val="0"/>
+          <w:numId w:val="1001"/>
+        </w:numPr>
+        <w:pStyle w:val="Compact"/>
+      </w:pPr>
+      <w:r>
+        <w:t xml:space="preserve">Tinbergen J. Shaping the World Economy: Suggestions for an International Economic Policy. New York: Twentieth Century Fund, 1962.</w:t>
+      </w:r>
+    </w:p>
+    <w:p>
+      <w:pPr>
+        <w:numPr>
+          <w:ilvl w:val="0"/>
+          <w:numId w:val="1001"/>
+        </w:numPr>
+        <w:pStyle w:val="Compact"/>
+      </w:pPr>
+      <w:r>
+        <w:t xml:space="preserve">Weidner M., Zylkin T. Bias and consistency in three-way gravity models // Journal of International Economics. 2021. Vol. 132. Art. 103513.</w:t>
+      </w:r>
+    </w:p>
+    <w:p>
+      <w:pPr>
+        <w:numPr>
+          <w:ilvl w:val="0"/>
+          <w:numId w:val="1001"/>
+        </w:numPr>
+        <w:pStyle w:val="Compact"/>
+      </w:pPr>
+      <w:r>
+        <w:t xml:space="preserve">Yalcin E., Felbermayr G., Kariem H., Kirilakha A., Kwon O., Syropoulos C., Yotov Y. V. The Global Sanctions Data Base — Release 4: the heterogeneous effects of the sanctions on Russia // The World Economy. 2025. Vol. 48. No. 9. P. 2003–2017.</w:t>
+      </w:r>
+    </w:p>
+    <w:p>
+      <w:pPr>
+        <w:numPr>
+          <w:ilvl w:val="0"/>
+          <w:numId w:val="1001"/>
+        </w:numPr>
+        <w:pStyle w:val="Compact"/>
+      </w:pPr>
+      <w:r>
+        <w:t xml:space="preserve">Yotov Y. V. Gravity at sixty: the workhorse model of trade. CESifo Working Paper No. 9584. 2022.</w:t>
+      </w:r>
+    </w:p>
+    <w:p>
+      <w:pPr>
+        <w:numPr>
+          <w:ilvl w:val="0"/>
+          <w:numId w:val="1001"/>
+        </w:numPr>
+        <w:pStyle w:val="Compact"/>
+      </w:pPr>
+      <w:r>
         <w:t xml:space="preserve">Yotov Y. V., Piermartini R., Monteiro J.-A., Larch M. An Advanced Guide to Trade Policy Analysis: The Structural Gravity Model. Geneva: World Trade Organization, 2016.</w:t>
       </w:r>
     </w:p>
@@ -25691,8 +25789,8 @@
         <w:t xml:space="preserve">World Development Indicators. World Bank (ВВП в текущих долларах США, численность населения); International Monetary Fund. World Economic Outlook Database (ВВП на душу населения за 2024 г.).</w:t>
       </w:r>
     </w:p>
-    <w:bookmarkEnd w:id="66"/>
-    <w:bookmarkStart w:id="70" w:name="приложение-а.-аудит-исходных-данных"/>
+    <w:bookmarkEnd w:id="67"/>
+    <w:bookmarkStart w:id="71" w:name="приложение-а.-аудит-исходных-данных"/>
     <w:p>
       <w:pPr>
         <w:pStyle w:val="Heading1"/>
@@ -27211,18 +27309,18 @@
           <wp:inline>
             <wp:extent cx="5579999" cy="2948485"/>
             <wp:effectExtent b="0" l="0" r="0" t="0"/>
-            <wp:docPr descr="Рисунок А1 — Аудит данных: а) доля пар без России с изменением торговли более чем в e ≈ 2,7 раза за год; б) расстояния исходного набора и расстояния между столицами CEPII (логарифмические шкалы). Источник: расчёты автора." title="" id="68" name="Picture"/>
+            <wp:docPr descr="Рисунок А1 — Аудит данных: а) доля пар без России с изменением торговли более чем в e ≈ 2,7 раза за год; б) расстояния исходного набора и расстояния между столицами CEPII (логарифмические шкалы). Источник: расчёты автора." title="" id="69" name="Picture"/>
             <a:graphic>
               <a:graphicData uri="http://schemas.openxmlformats.org/drawingml/2006/picture">
                 <pic:pic>
                   <pic:nvPicPr>
-                    <pic:cNvPr descr="figures/figA1_data_quality.png" id="69" name="Picture"/>
+                    <pic:cNvPr descr="figures/figA1_data_quality.png" id="70" name="Picture"/>
                     <pic:cNvPicPr>
                       <a:picLocks noChangeArrowheads="1" noChangeAspect="1"/>
                     </pic:cNvPicPr>
                   </pic:nvPicPr>
                   <pic:blipFill>
-                    <a:blip r:embed="rId67"/>
+                    <a:blip r:embed="rId68"/>
                     <a:stretch>
                       <a:fillRect/>
                     </a:stretch>
@@ -27284,8 +27382,8 @@
         <w:t xml:space="preserve">) и исключаются в проверках устойчивости; пары с ОАЭ и Беларусью исключаются в «чистой» выборке (табл. 2, столбец 5).</w:t>
       </w:r>
     </w:p>
-    <w:bookmarkEnd w:id="70"/>
-    <w:bookmarkStart w:id="71" w:name="приложение-б.-состав-групп-стран"/>
+    <w:bookmarkEnd w:id="71"/>
+    <w:bookmarkStart w:id="72" w:name="приложение-б.-состав-групп-стран"/>
     <w:p>
       <w:pPr>
         <w:pStyle w:val="Heading1"/>
@@ -27640,8 +27738,8 @@
         </w:tc>
       </w:tr>
     </w:tbl>
-    <w:bookmarkEnd w:id="71"/>
-    <w:bookmarkStart w:id="72" w:name="приложение-в.-хронология-членства"/>
+    <w:bookmarkEnd w:id="72"/>
+    <w:bookmarkStart w:id="73" w:name="приложение-в.-хронология-членства"/>
     <w:p>
       <w:pPr>
         <w:pStyle w:val="Heading1"/>
@@ -28058,8 +28156,8 @@
         </w:tc>
       </w:tr>
     </w:tbl>
-    <w:bookmarkEnd w:id="72"/>
-    <w:bookmarkStart w:id="73" w:name="приложение-г.-результаты-по-партнёрам"/>
+    <w:bookmarkEnd w:id="73"/>
+    <w:bookmarkStart w:id="74" w:name="приложение-г.-результаты-по-партнёрам"/>
     <w:p>
       <w:pPr>
         <w:pStyle w:val="Heading1"/>
@@ -36654,8 +36752,8 @@
         </w:tc>
       </w:tr>
     </w:tbl>
-    <w:bookmarkEnd w:id="73"/>
-    <w:bookmarkStart w:id="74" w:name="X345b16f3a1eba4527010e0716c3bcc035449a34"/>
+    <w:bookmarkEnd w:id="74"/>
+    <w:bookmarkStart w:id="75" w:name="X345b16f3a1eba4527010e0716c3bcc035449a34"/>
     <w:p>
       <w:pPr>
         <w:pStyle w:val="Heading1"/>
@@ -41560,8 +41658,8 @@
         </w:tc>
       </w:tr>
     </w:tbl>
-    <w:bookmarkEnd w:id="74"/>
-    <w:bookmarkStart w:id="78" w:name="приложение-е.-перестановочный-тест"/>
+    <w:bookmarkEnd w:id="75"/>
+    <w:bookmarkStart w:id="79" w:name="приложение-е.-перестановочный-тест"/>
     <w:p>
       <w:pPr>
         <w:pStyle w:val="Heading1"/>
@@ -41579,18 +41677,18 @@
           <wp:inline>
             <wp:extent cx="5219999" cy="2537112"/>
             <wp:effectExtent b="0" l="0" r="0" t="0"/>
-            <wp:docPr descr="Рисунок А2 — Распределение оценок \text{SANC}^{14} (а) и \text{SANC}^{22} (б) при случайном присвоении метки «коалиция» 14 из 29 российских партнёров (500 назначений). Вертикальная линия — оценка по реальной коалиции. Источник: расчёты автора." title="" id="76" name="Picture"/>
+            <wp:docPr descr="Рисунок А2 — Распределение оценок \text{SANC}^{14} (а) и \text{SANC}^{22} (б) при случайном присвоении метки «коалиция» 14 из 29 российских партнёров (500 назначений). Вертикальная линия — оценка по реальной коалиции. Источник: расчёты автора." title="" id="77" name="Picture"/>
             <a:graphic>
               <a:graphicData uri="http://schemas.openxmlformats.org/drawingml/2006/picture">
                 <pic:pic>
                   <pic:nvPicPr>
-                    <pic:cNvPr descr="figures/figA2_permutation.png" id="77" name="Picture"/>
+                    <pic:cNvPr descr="figures/figA2_permutation.png" id="78" name="Picture"/>
                     <pic:cNvPicPr>
                       <a:picLocks noChangeArrowheads="1" noChangeAspect="1"/>
                     </pic:cNvPicPr>
                   </pic:nvPicPr>
                   <pic:blipFill>
-                    <a:blip r:embed="rId75"/>
+                    <a:blip r:embed="rId76"/>
                     <a:stretch>
                       <a:fillRect/>
                     </a:stretch>
@@ -41679,7 +41777,7 @@
         <w:t xml:space="preserve">(б) при случайном присвоении метки «коалиция» 14 из 29 российских партнёров (500 назначений). Вертикальная линия — оценка по реальной коалиции. Источник: расчёты автора.</w:t>
       </w:r>
     </w:p>
-    <w:bookmarkEnd w:id="78"/>
+    <w:bookmarkEnd w:id="79"/>
     <w:sectPr>
       <w:footerReference w:type="default" r:id="rId9"/>
       <w:pgSz w:h="16838" w:w="11906"/>
@@ -41895,11 +41993,11 @@
       </w:pPr>
     </w:lvl>
   </w:abstractNum>
-  <w:abstractNum w:abstractNumId="994162">
-    <w:nsid w:val="A994162"/>
+  <w:abstractNum w:abstractNumId="994168">
+    <w:nsid w:val="A994168"/>
     <w:multiLevelType w:val="multilevel"/>
     <w:lvl w:ilvl="0">
-      <w:start w:val="62"/>
+      <w:start w:val="68"/>
       <w:numFmt w:val="decimal"/>
       <w:lvlText w:val="%1."/>
       <w:lvlJc w:val="left"/>
@@ -41908,7 +42006,7 @@
       </w:pPr>
     </w:lvl>
     <w:lvl w:ilvl="1">
-      <w:start w:val="62"/>
+      <w:start w:val="68"/>
       <w:numFmt w:val="decimal"/>
       <w:lvlText w:val="%2."/>
       <w:lvlJc w:val="left"/>
@@ -41917,7 +42015,7 @@
       </w:pPr>
     </w:lvl>
     <w:lvl w:ilvl="2">
-      <w:start w:val="62"/>
+      <w:start w:val="68"/>
       <w:numFmt w:val="decimal"/>
       <w:lvlText w:val="%3."/>
       <w:lvlJc w:val="left"/>
@@ -41926,7 +42024,7 @@
       </w:pPr>
     </w:lvl>
     <w:lvl w:ilvl="3">
-      <w:start w:val="62"/>
+      <w:start w:val="68"/>
       <w:numFmt w:val="decimal"/>
       <w:lvlText w:val="%4."/>
       <w:lvlJc w:val="left"/>
@@ -41935,7 +42033,7 @@
       </w:pPr>
     </w:lvl>
     <w:lvl w:ilvl="4">
-      <w:start w:val="62"/>
+      <w:start w:val="68"/>
       <w:numFmt w:val="decimal"/>
       <w:lvlText w:val="%5."/>
       <w:lvlJc w:val="left"/>
@@ -41944,7 +42042,7 @@
       </w:pPr>
     </w:lvl>
     <w:lvl w:ilvl="5">
-      <w:start w:val="62"/>
+      <w:start w:val="68"/>
       <w:numFmt w:val="decimal"/>
       <w:lvlText w:val="%6."/>
       <w:lvlJc w:val="left"/>
@@ -41953,7 +42051,7 @@
       </w:pPr>
     </w:lvl>
     <w:lvl w:ilvl="6">
-      <w:start w:val="62"/>
+      <w:start w:val="68"/>
       <w:numFmt w:val="decimal"/>
       <w:lvlText w:val="%7."/>
       <w:lvlJc w:val="left"/>
@@ -41962,7 +42060,7 @@
       </w:pPr>
     </w:lvl>
     <w:lvl w:ilvl="7">
-      <w:start w:val="62"/>
+      <w:start w:val="68"/>
       <w:numFmt w:val="decimal"/>
       <w:lvlText w:val="%8."/>
       <w:lvlJc w:val="left"/>
@@ -41971,7 +42069,7 @@
       </w:pPr>
     </w:lvl>
     <w:lvl w:ilvl="8">
-      <w:start w:val="62"/>
+      <w:start w:val="68"/>
       <w:numFmt w:val="decimal"/>
       <w:lvlText w:val="%9."/>
       <w:lvlJc w:val="left"/>
@@ -42014,33 +42112,33 @@
     </w:lvlOverride>
   </w:num>
   <w:num w:numId="1002">
-    <w:abstractNumId w:val="994162"/>
+    <w:abstractNumId w:val="994168"/>
     <w:lvlOverride w:ilvl="0">
-      <w:startOverride w:val="62"/>
+      <w:startOverride w:val="68"/>
     </w:lvlOverride>
     <w:lvlOverride w:ilvl="1">
-      <w:startOverride w:val="62"/>
+      <w:startOverride w:val="68"/>
     </w:lvlOverride>
     <w:lvlOverride w:ilvl="2">
-      <w:startOverride w:val="62"/>
+      <w:startOverride w:val="68"/>
     </w:lvlOverride>
     <w:lvlOverride w:ilvl="3">
-      <w:startOverride w:val="62"/>
+      <w:startOverride w:val="68"/>
     </w:lvlOverride>
     <w:lvlOverride w:ilvl="4">
-      <w:startOverride w:val="62"/>
+      <w:startOverride w:val="68"/>
     </w:lvlOverride>
     <w:lvlOverride w:ilvl="5">
-      <w:startOverride w:val="62"/>
+      <w:startOverride w:val="68"/>
     </w:lvlOverride>
     <w:lvlOverride w:ilvl="6">
-      <w:startOverride w:val="62"/>
+      <w:startOverride w:val="68"/>
     </w:lvlOverride>
     <w:lvlOverride w:ilvl="7">
-      <w:startOverride w:val="62"/>
+      <w:startOverride w:val="68"/>
     </w:lvlOverride>
     <w:lvlOverride w:ilvl="8">
-      <w:startOverride w:val="62"/>
+      <w:startOverride w:val="68"/>
     </w:lvlOverride>
   </w:num>
 </w:numbering>

</xml_diff>